<commit_message>
Use confirmed NIST reference assets
</commit_message>
<xml_diff>
--- a/docs/WCC4SM_V0.6.2_软件架构与功能技术说明书_V1.0.docx
+++ b/docs/WCC4SM_V0.6.2_软件架构与功能技术说明书_V1.0.docx
@@ -2412,17 +2412,17 @@
           <w:sz w:val="21"/>
           <w:szCs w:val="21"/>
         </w:rPr>
-        <w:t>• 参考选择值 772.4000 nm 与 NIST 772.4207 nm 存在 0.0207 nm 边界差异，</w:t>
-      </w:r>
-    </w:p>
-    <w:p>
-      <w:r>
-        <w:rPr>
-          <w:rFonts w:ascii="Microsoft YaHei" w:hAnsi="Microsoft YaHei"/>
-          <w:sz w:val="21"/>
-          <w:szCs w:val="21"/>
-        </w:rPr>
-        <w:t>应作为参考数据决策处理，不应仅放宽匹配容差。</w:t>
+        <w:t>• 当前 Mode01 的 29 条波长均与已确认的日期化 NIST 主库精确一致；更换主库</w:t>
+      </w:r>
+    </w:p>
+    <w:p>
+      <w:r>
+        <w:rPr>
+          <w:rFonts w:ascii="Microsoft YaHei" w:hAnsi="Microsoft YaHei"/>
+          <w:sz w:val="21"/>
+          <w:szCs w:val="21"/>
+        </w:rPr>
+        <w:t>或模式时必须新建版本并重新运行数据资产测试。</w:t>
       </w:r>
     </w:p>
     <w:p>

</xml_diff>